<commit_message>
Add operational-fit teaser to Part 2
New early beat after the call framing: teams assess partners across
metrics and value operational support; for Redo the fit is the team
store, with three short examples worth exploring (returns and exchanges,
order tracking for fan merchandise, post-purchase fan support). Part 2
timing updated to two minutes in the heading and navigator.

Co-Authored-By: Claude Fable 5 <noreply@anthropic.com>
Claude-Session: https://claude.ai/code/session_011Vvxd2V3zerAfjn84yXuuv
</commit_message>
<xml_diff>
--- a/call-scripts/Redo-F1-Discovery-Call-Script.docx
+++ b/call-scripts/Redo-F1-Discovery-Call-Script.docx
@@ -367,7 +367,7 @@
                 <w:sz w:val="20"/>
                 <w:szCs w:val="20"/>
               </w:rPr>
-              <w:t xml:space="preserve">Frame the call: two purposes, then a soft opener</w:t>
+              <w:t xml:space="preserve">Frame the call: two purposes, the operational-fit teaser, a soft opener</w:t>
             </w:r>
           </w:p>
         </w:tc>
@@ -398,7 +398,7 @@
                 <w:sz w:val="20"/>
                 <w:szCs w:val="20"/>
               </w:rPr>
-              <w:t xml:space="preserve">1 min</w:t>
+              <w:t xml:space="preserve">2 min</w:t>
             </w:r>
           </w:p>
         </w:tc>
@@ -2111,7 +2111,7 @@
         <w:spacing w:after="160" w:before="360"/>
       </w:pPr>
       <w:r>
-        <w:t xml:space="preserve">Part 2. Frame the call (1 minute)</w:t>
+        <w:t xml:space="preserve">Part 2. Frame the call (2 minutes)</w:t>
       </w:r>
     </w:p>
     <w:p>
@@ -2210,6 +2210,76 @@
       </w:pPr>
       <w:r>
         <w:t xml:space="preserve">Does that work for you?</w:t>
+      </w:r>
+    </w:p>
+    <w:p>
+      <w:pPr>
+        <w:pStyle w:val="Heading3"/>
+        <w:spacing w:after="100" w:before="240"/>
+      </w:pPr>
+      <w:r>
+        <w:t xml:space="preserve">Why Redo caught my attention</w:t>
+      </w:r>
+    </w:p>
+    <w:p>
+      <w:pPr>
+        <w:spacing w:after="100" w:before="60"/>
+      </w:pPr>
+      <w:r>
+        <w:rPr>
+          <w:i/>
+          <w:iCs/>
+          <w:color w:val="595959"/>
+          <w:sz w:val="20"/>
+          <w:szCs w:val="20"/>
+        </w:rPr>
+        <w:t xml:space="preserve">[Say this early. It plants the integration idea you will ask about in Part 3.]</w:t>
+      </w:r>
+    </w:p>
+    <w:p>
+      <w:pPr>
+        <w:pBdr>
+          <w:left w:val="single" w:color="1F3864" w:sz="18"/>
+        </w:pBdr>
+        <w:shd w:fill="F2F4F8" w:val="clear"/>
+        <w:spacing w:after="60" w:before="80" w:line="264"/>
+        <w:ind w:left="280" w:right="120"/>
+      </w:pPr>
+      <w:r>
+        <w:t xml:space="preserve">One thing worth sharing before my questions. When teams assess a new partner, they look across different metrics: budget, brand, audience fit. And one question they always ask: </w:t>
+      </w:r>
+      <w:r>
+        <w:rPr>
+          <w:b/>
+          <w:bCs/>
+        </w:rPr>
+        <w:t xml:space="preserve">can this partner also support us operationally?</w:t>
+      </w:r>
+      <w:r>
+        <w:t xml:space="preserve"> A partner whose product does real work inside the team is worth more than a logo alone.</w:t>
+      </w:r>
+    </w:p>
+    <w:p>
+      <w:pPr>
+        <w:pBdr>
+          <w:left w:val="single" w:color="1F3864" w:sz="18"/>
+        </w:pBdr>
+        <w:shd w:fill="F2F4F8" w:val="clear"/>
+        <w:spacing w:after="160" w:before="0" w:line="264"/>
+        <w:ind w:left="280" w:right="120"/>
+      </w:pPr>
+      <w:r>
+        <w:t xml:space="preserve">Looking at Redo, I think there is a fit. Every team runs its own online store and serves fans all over the world. So potentially worth exploring: </w:t>
+      </w:r>
+      <w:r>
+        <w:rPr>
+          <w:b/>
+          <w:bCs/>
+        </w:rPr>
+        <w:t xml:space="preserve">team store returns and exchanges, order tracking for fan merchandise, post-purchase fan support.</w:t>
+      </w:r>
+      <w:r>
+        <w:t xml:space="preserve"> Early thoughts. The brief will tell us more.</w:t>
       </w:r>
     </w:p>
     <w:p>

</xml_diff>

<commit_message>
Make the how-we-work sequence explicit after the mandate story
The About SPORTFIVE block now flows: gave up exclusive mandates, why
(your side of the table), how we work instead (brief, grid mapping,
relevant opportunities, negotiation), then the fee model. Previously the
process steps only appeared in the Part 2 call framing.

Co-Authored-By: Claude Fable 5 <noreply@anthropic.com>
Claude-Session: https://claude.ai/code/session_011Vvxd2V3zerAfjn84yXuuv
</commit_message>
<xml_diff>
--- a/call-scripts/Redo-F1-Discovery-Call-Script.docx
+++ b/call-scripts/Redo-F1-Discovery-Call-Script.docx
@@ -2051,7 +2051,30 @@
         <w:t xml:space="preserve">your side of the table</w:t>
       </w:r>
       <w:r>
-        <w:t xml:space="preserve">. We are not here to push one team at you. We look at the whole grid, and we recommend what is right for Redo.</w:t>
+        <w:t xml:space="preserve">. We are not here to push one team at you.</w:t>
+      </w:r>
+    </w:p>
+    <w:p>
+      <w:pPr>
+        <w:pBdr>
+          <w:left w:val="single" w:color="1F3864" w:sz="18"/>
+        </w:pBdr>
+        <w:shd w:fill="F2F4F8" w:val="clear"/>
+        <w:spacing w:after="60" w:before="0" w:line="264"/>
+        <w:ind w:left="280" w:right="120"/>
+      </w:pPr>
+      <w:r>
+        <w:t xml:space="preserve">So how do we work instead? Very simple. </w:t>
+      </w:r>
+      <w:r>
+        <w:rPr>
+          <w:b/>
+          <w:bCs/>
+        </w:rPr>
+        <w:t xml:space="preserve">You give us a brief. We map it against all eleven teams.</w:t>
+      </w:r>
+      <w:r>
+        <w:t xml:space="preserve"> We bring you the most relevant opportunities, and when you like one, we negotiate it on your side.</w:t>
       </w:r>
     </w:p>
     <w:p>
@@ -2064,7 +2087,7 @@
         <w:ind w:left="280" w:right="120"/>
       </w:pPr>
       <w:r>
-        <w:t xml:space="preserve">And one important thing about how we work. </w:t>
+        <w:t xml:space="preserve">And the most important part. </w:t>
       </w:r>
       <w:r>
         <w:rPr>
@@ -2074,7 +2097,7 @@
         <w:t xml:space="preserve">Our fee is paid by the teams, not by you.</w:t>
       </w:r>
       <w:r>
-        <w:t xml:space="preserve"> All the work we do for you, the research, the grid analysis, the evaluation, the negotiation, costs you nothing. When a deal happens, the rights holder pays us. So our interest is simple: find you the right home in Formula 1, because that is the only way we get paid.</w:t>
+        <w:t xml:space="preserve"> All the work I just described, the research, the grid mapping, the evaluation, the negotiation, costs you nothing. When a deal happens, the rights holder pays us. So our interest is simple: find you the right home in Formula 1, because that is the only way we get paid.</w:t>
       </w:r>
     </w:p>
     <w:p>

</xml_diff>

<commit_message>
Add pricing economics: how pricing works and why F1 costs more
Cost answer rebuilt to cover the pricing logic (rights inside the deal
set the price) and four reasons F1 is more expensive: scarce supply
(eleven teams worldwide, one category seat each, multi-year deals),
demand doubling since 2020 with the reported Microsoft x Mercedes fee as
evidence, one contract covering around 24 races across five continents,
and the access premium. Part 4.4 gains a short supply-and-demand closing
beat so the point lands proactively, and the navigator carries the
pricing-logic line.

Co-Authored-By: Claude Fable 5 <noreply@anthropic.com>
Claude-Session: https://claude.ai/code/session_011Vvxd2V3zerAfjn84yXuuv
</commit_message>
<xml_diff>
--- a/call-scripts/Redo-F1-Discovery-Call-Script.docx
+++ b/call-scripts/Redo-F1-Discovery-Call-Script.docx
@@ -1459,6 +1459,70 @@
                 <w:sz w:val="20"/>
                 <w:szCs w:val="20"/>
               </w:rPr>
+              <w:t xml:space="preserve">11 teams worldwide, one category seat each, 3 to 5 year deals</w:t>
+            </w:r>
+          </w:p>
+        </w:tc>
+        <w:tc>
+          <w:tcPr>
+            <w:tcW w:type="dxa" w:w="3600"/>
+            <w:tcBorders>
+              <w:top w:val="single" w:color="C9CFDA" w:sz="6"/>
+              <w:left w:val="single" w:color="C9CFDA" w:sz="6"/>
+              <w:bottom w:val="single" w:color="C9CFDA" w:sz="6"/>
+              <w:right w:val="single" w:color="C9CFDA" w:sz="6"/>
+            </w:tcBorders>
+            <w:tcMar>
+              <w:top w:type="dxa" w:w="60"/>
+              <w:left w:type="dxa" w:w="100"/>
+              <w:bottom w:type="dxa" w:w="60"/>
+              <w:right w:type="dxa" w:w="100"/>
+            </w:tcMar>
+          </w:tcPr>
+          <w:p>
+            <w:pPr>
+              <w:spacing w:after="0"/>
+            </w:pPr>
+            <w:r>
+              <w:rPr>
+                <w:b w:val="false"/>
+                <w:bCs w:val="false"/>
+                <w:sz w:val="20"/>
+                <w:szCs w:val="20"/>
+              </w:rPr>
+              <w:t xml:space="preserve">Why it costs more</w:t>
+            </w:r>
+          </w:p>
+        </w:tc>
+      </w:tr>
+      <w:tr>
+        <w:tc>
+          <w:tcPr>
+            <w:tcW w:type="dxa" w:w="5426"/>
+            <w:tcBorders>
+              <w:top w:val="single" w:color="C9CFDA" w:sz="6"/>
+              <w:left w:val="single" w:color="C9CFDA" w:sz="6"/>
+              <w:bottom w:val="single" w:color="C9CFDA" w:sz="6"/>
+              <w:right w:val="single" w:color="C9CFDA" w:sz="6"/>
+            </w:tcBorders>
+            <w:tcMar>
+              <w:top w:type="dxa" w:w="60"/>
+              <w:left w:type="dxa" w:w="100"/>
+              <w:bottom w:type="dxa" w:w="60"/>
+              <w:right w:type="dxa" w:w="100"/>
+            </w:tcMar>
+          </w:tcPr>
+          <w:p>
+            <w:pPr>
+              <w:spacing w:after="0"/>
+            </w:pPr>
+            <w:r>
+              <w:rPr>
+                <w:b/>
+                <w:bCs/>
+                <w:sz w:val="20"/>
+                <w:szCs w:val="20"/>
+              </w:rPr>
               <w:t xml:space="preserve">2.2bn social engagements. Number one in sport, ahead of the NBA</w:t>
             </w:r>
           </w:p>
@@ -3152,21 +3216,54 @@
           <w:left w:val="single" w:color="1F3864" w:sz="18"/>
         </w:pBdr>
         <w:shd w:fill="F2F4F8" w:val="clear"/>
+        <w:spacing w:after="60" w:before="0" w:line="264"/>
+        <w:ind w:left="280" w:right="120"/>
+      </w:pPr>
+      <w:r>
+        <w:t xml:space="preserve">And here is the thing most people miss about Formula 1. What really drives the value of these partnerships is not the logo. It is the </w:t>
+      </w:r>
+      <w:r>
+        <w:rPr>
+          <w:b/>
+          <w:bCs/>
+        </w:rPr>
+        <w:t xml:space="preserve">access</w:t>
+      </w:r>
+      <w:r>
+        <w:t xml:space="preserve">. The premium experiences the sport delivers, on track and off track, are the best in all of sport. Nobody does hospitality like Formula 1. That is what partners are buying, and that is what opens the doors.</w:t>
+      </w:r>
+    </w:p>
+    <w:p>
+      <w:pPr>
+        <w:pBdr>
+          <w:left w:val="single" w:color="1F3864" w:sz="18"/>
+        </w:pBdr>
+        <w:shd w:fill="F2F4F8" w:val="clear"/>
         <w:spacing w:after="160" w:before="0" w:line="264"/>
         <w:ind w:left="280" w:right="120"/>
       </w:pPr>
       <w:r>
-        <w:t xml:space="preserve">And here is the thing most people miss about Formula 1. What really drives the value of these partnerships is not the logo. It is the </w:t>
-      </w:r>
-      <w:r>
-        <w:rPr>
-          <w:b/>
-          <w:bCs/>
-        </w:rPr>
-        <w:t xml:space="preserve">access</w:t>
-      </w:r>
-      <w:r>
-        <w:t xml:space="preserve">. The premium experiences the sport delivers, on track and off track, are the best in all of sport. Nobody does hospitality like Formula 1. That is what partners are buying, and that is what opens the doors.</w:t>
+        <w:t xml:space="preserve">One last thing on value. All of this sits on very small supply. Football has hundreds of clubs. Formula 1 has </w:t>
+      </w:r>
+      <w:r>
+        <w:rPr>
+          <w:b/>
+          <w:bCs/>
+        </w:rPr>
+        <w:t xml:space="preserve">eleven teams, for the entire world</w:t>
+      </w:r>
+      <w:r>
+        <w:t xml:space="preserve">, and inside each team your category has exactly one seat. </w:t>
+      </w:r>
+      <w:r>
+        <w:rPr>
+          <w:b/>
+          <w:bCs/>
+        </w:rPr>
+        <w:t xml:space="preserve">Small supply, growing demand.</w:t>
+      </w:r>
+      <w:r>
+        <w:t xml:space="preserve"> That is why these partnerships are not cheap, and why they hold their value.</w:t>
       </w:r>
     </w:p>
     <w:p>
@@ -3835,7 +3932,7 @@
         <w:spacing w:after="120" w:before="280"/>
       </w:pPr>
       <w:r>
-        <w:t xml:space="preserve">Q: What does a partnership cost?</w:t>
+        <w:t xml:space="preserve">Q: What does a partnership cost, and why is Formula 1 so expensive?</w:t>
       </w:r>
     </w:p>
     <w:p>
@@ -3863,20 +3960,20 @@
         <w:ind w:left="280" w:right="120"/>
       </w:pPr>
       <w:r>
-        <w:t xml:space="preserve">A wide range, and that is the honest answer.</w:t>
-      </w:r>
-    </w:p>
-    <w:p>
-      <w:pPr>
-        <w:pBdr>
-          <w:left w:val="single" w:color="1F3864" w:sz="18"/>
-        </w:pBdr>
-        <w:shd w:fill="F2F4F8" w:val="clear"/>
-        <w:spacing w:after="60" w:before="0" w:line="264"/>
-        <w:ind w:left="280" w:right="120"/>
-      </w:pPr>
-      <w:r>
-        <w:t xml:space="preserve">As a rule of thumb: entry-level and supplier positions start in the </w:t>
+        <w:t xml:space="preserve">Let me explain how the pricing works, because Formula 1 has its own logic.</w:t>
+      </w:r>
+    </w:p>
+    <w:p>
+      <w:pPr>
+        <w:pBdr>
+          <w:left w:val="single" w:color="1F3864" w:sz="18"/>
+        </w:pBdr>
+        <w:shd w:fill="F2F4F8" w:val="clear"/>
+        <w:spacing w:after="60" w:before="0" w:line="264"/>
+        <w:ind w:left="280" w:right="120"/>
+      </w:pPr>
+      <w:r>
+        <w:t xml:space="preserve">The price follows the rights inside the deal: your tier, the size and position of your branding, driver time, content days, hospitality volume, and the category you lock. More rights, higher price. As a rule of thumb: entry-level and supplier positions start in the </w:t>
       </w:r>
       <w:r>
         <w:rPr>
@@ -3886,7 +3983,7 @@
         <w:t xml:space="preserve">low single-digit millions</w:t>
       </w:r>
       <w:r>
-        <w:t xml:space="preserve"> per year. Meaningful official partner positions with real rights and hospitality usually sit in the </w:t>
+        <w:t xml:space="preserve"> per year. Meaningful official partner positions with real rights and hospitality sit in the </w:t>
       </w:r>
       <w:r>
         <w:rPr>
@@ -3915,11 +4012,116 @@
           <w:left w:val="single" w:color="1F3864" w:sz="18"/>
         </w:pBdr>
         <w:shd w:fill="F2F4F8" w:val="clear"/>
+        <w:spacing w:after="60" w:before="0" w:line="264"/>
+        <w:ind w:left="280" w:right="120"/>
+      </w:pPr>
+      <w:r>
+        <w:t xml:space="preserve">And yes, Formula 1 costs more than most sport. There are clear reasons.</w:t>
+      </w:r>
+    </w:p>
+    <w:p>
+      <w:pPr>
+        <w:pBdr>
+          <w:left w:val="single" w:color="1F3864" w:sz="18"/>
+        </w:pBdr>
+        <w:shd w:fill="F2F4F8" w:val="clear"/>
+        <w:spacing w:after="60" w:before="0" w:line="264"/>
+        <w:ind w:left="280" w:right="120"/>
+      </w:pPr>
+      <w:r>
+        <w:t xml:space="preserve"/>
+      </w:r>
+      <w:r>
+        <w:rPr>
+          <w:b/>
+          <w:bCs/>
+        </w:rPr>
+        <w:t xml:space="preserve">First, supply.</w:t>
+      </w:r>
+      <w:r>
+        <w:t xml:space="preserve"> Football has hundreds of clubs. American leagues have around thirty teams, mostly in one market. Formula 1 has eleven teams, for the entire world. And inside each team, your category has exactly one seat. When a competitor takes it, it is gone, usually for three to five years. So for any brand, there are at most eleven doors on earth.</w:t>
+      </w:r>
+    </w:p>
+    <w:p>
+      <w:pPr>
+        <w:pBdr>
+          <w:left w:val="single" w:color="1F3864" w:sz="18"/>
+        </w:pBdr>
+        <w:shd w:fill="F2F4F8" w:val="clear"/>
+        <w:spacing w:after="60" w:before="0" w:line="264"/>
+        <w:ind w:left="280" w:right="120"/>
+      </w:pPr>
+      <w:r>
+        <w:t xml:space="preserve"/>
+      </w:r>
+      <w:r>
+        <w:rPr>
+          <w:b/>
+          <w:bCs/>
+        </w:rPr>
+        <w:t xml:space="preserve">Second, demand.</w:t>
+      </w:r>
+      <w:r>
+        <w:t xml:space="preserve"> Team sponsorship has doubled since 2020, from about one billion to 2.2 billion dollars a year. New money keeps arriving: Microsoft joined Mercedes this year at a reported sixty million dollars a season. Tiny supply, growing demand. Prices rise.</w:t>
+      </w:r>
+    </w:p>
+    <w:p>
+      <w:pPr>
+        <w:pBdr>
+          <w:left w:val="single" w:color="1F3864" w:sz="18"/>
+        </w:pBdr>
+        <w:shd w:fill="F2F4F8" w:val="clear"/>
+        <w:spacing w:after="60" w:before="0" w:line="264"/>
+        <w:ind w:left="280" w:right="120"/>
+      </w:pPr>
+      <w:r>
+        <w:t xml:space="preserve"/>
+      </w:r>
+      <w:r>
+        <w:rPr>
+          <w:b/>
+          <w:bCs/>
+        </w:rPr>
+        <w:t xml:space="preserve">Third, one deal covers the world.</w:t>
+      </w:r>
+      <w:r>
+        <w:t xml:space="preserve"> A domestic league lives mostly in its home market. Formula 1 gives you around 24 races across five continents, in one contract. For a brand going global, one F1 deal can replace many local ones.</w:t>
+      </w:r>
+    </w:p>
+    <w:p>
+      <w:pPr>
+        <w:pBdr>
+          <w:left w:val="single" w:color="1F3864" w:sz="18"/>
+        </w:pBdr>
+        <w:shd w:fill="F2F4F8" w:val="clear"/>
+        <w:spacing w:after="60" w:before="0" w:line="264"/>
+        <w:ind w:left="280" w:right="120"/>
+      </w:pPr>
+      <w:r>
+        <w:t xml:space="preserve"/>
+      </w:r>
+      <w:r>
+        <w:rPr>
+          <w:b/>
+          <w:bCs/>
+        </w:rPr>
+        <w:t xml:space="preserve">And fourth, access.</w:t>
+      </w:r>
+      <w:r>
+        <w:t xml:space="preserve"> The paddock, the hospitality, the room with 350 companies in it. That is what carries the price, because nobody else can offer it.</w:t>
+      </w:r>
+    </w:p>
+    <w:p>
+      <w:pPr>
+        <w:pBdr>
+          <w:left w:val="single" w:color="1F3864" w:sz="18"/>
+        </w:pBdr>
+        <w:shd w:fill="F2F4F8" w:val="clear"/>
         <w:spacing w:after="160" w:before="0" w:line="264"/>
         <w:ind w:left="280" w:right="120"/>
       </w:pPr>
       <w:r>
-        <w:t xml:space="preserve">This is exactly why we do the brief first. Our job is to match the level to your goals, and to negotiate it on your side. And remember, our advice costs you nothing.</w:t>
+        <w:t xml:space="preserve">This is why we do the brief first. Our job is to match the level to your goals, and then negotiate it hard on your side. And remember, our advice costs you nothing.</w:t>
       </w:r>
     </w:p>
     <w:p>

</xml_diff>

<commit_message>
Add hospitality rotation point and tidy the script structure
Hospitality section in Part 4.2 now carries the three-day rotation
point: passes work every day of a race weekend, so seven passes can
host twenty different guests in one weekend and hundreds across a
season. Structure pass: Part 5 questions numbered Q1 to Q11 with a
quick index under the heading, a hospitality-maths line added to the
navigator and cheat sheet, and the Word document starts Part 5 on a
fresh page.

Co-Authored-By: Claude Fable 5 <noreply@anthropic.com>
Claude-Session: https://claude.ai/code/session_011Vvxd2V3zerAfjn84yXuuv
</commit_message>
<xml_diff>
--- a/call-scripts/Redo-F1-Discovery-Call-Script.docx
+++ b/call-scripts/Redo-F1-Discovery-Call-Script.docx
@@ -1331,6 +1331,70 @@
                 <w:sz w:val="20"/>
                 <w:szCs w:val="20"/>
               </w:rPr>
+              <w:t xml:space="preserve">Passes work all 3 days: rotate guests, 7 passes host 20 people a weekend</w:t>
+            </w:r>
+          </w:p>
+        </w:tc>
+        <w:tc>
+          <w:tcPr>
+            <w:tcW w:type="dxa" w:w="3600"/>
+            <w:tcBorders>
+              <w:top w:val="single" w:color="C9CFDA" w:sz="6"/>
+              <w:left w:val="single" w:color="C9CFDA" w:sz="6"/>
+              <w:bottom w:val="single" w:color="C9CFDA" w:sz="6"/>
+              <w:right w:val="single" w:color="C9CFDA" w:sz="6"/>
+            </w:tcBorders>
+            <w:tcMar>
+              <w:top w:type="dxa" w:w="60"/>
+              <w:left w:type="dxa" w:w="100"/>
+              <w:bottom w:type="dxa" w:w="60"/>
+              <w:right w:type="dxa" w:w="100"/>
+            </w:tcMar>
+          </w:tcPr>
+          <w:p>
+            <w:pPr>
+              <w:spacing w:after="0"/>
+            </w:pPr>
+            <w:r>
+              <w:rPr>
+                <w:b w:val="false"/>
+                <w:bCs w:val="false"/>
+                <w:sz w:val="20"/>
+                <w:szCs w:val="20"/>
+              </w:rPr>
+              <w:t xml:space="preserve">Hospitality maths</w:t>
+            </w:r>
+          </w:p>
+        </w:tc>
+      </w:tr>
+      <w:tr>
+        <w:tc>
+          <w:tcPr>
+            <w:tcW w:type="dxa" w:w="5426"/>
+            <w:tcBorders>
+              <w:top w:val="single" w:color="C9CFDA" w:sz="6"/>
+              <w:left w:val="single" w:color="C9CFDA" w:sz="6"/>
+              <w:bottom w:val="single" w:color="C9CFDA" w:sz="6"/>
+              <w:right w:val="single" w:color="C9CFDA" w:sz="6"/>
+            </w:tcBorders>
+            <w:tcMar>
+              <w:top w:type="dxa" w:w="60"/>
+              <w:left w:type="dxa" w:w="100"/>
+              <w:bottom w:type="dxa" w:w="60"/>
+              <w:right w:type="dxa" w:w="100"/>
+            </w:tcMar>
+          </w:tcPr>
+          <w:p>
+            <w:pPr>
+              <w:spacing w:after="0"/>
+            </w:pPr>
+            <w:r>
+              <w:rPr>
+                <w:b/>
+                <w:bCs/>
+                <w:sz w:val="20"/>
+                <w:szCs w:val="20"/>
+              </w:rPr>
               <w:t xml:space="preserve">350+ partner companies on the grid. 25+ per team</w:t>
             </w:r>
           </w:p>
@@ -2929,6 +2993,39 @@
         <w:ind w:left="280" w:right="120"/>
       </w:pPr>
       <w:r>
+        <w:t xml:space="preserve">And one detail people miss. A Grand Prix runs over three days, and your passes work every day. So </w:t>
+      </w:r>
+      <w:r>
+        <w:rPr>
+          <w:b/>
+          <w:bCs/>
+        </w:rPr>
+        <w:t xml:space="preserve">seven passes does not mean seven guests</w:t>
+      </w:r>
+      <w:r>
+        <w:t xml:space="preserve">. You bring different people on Friday, on Saturday, and on Sunday. Seven passes can host </w:t>
+      </w:r>
+      <w:r>
+        <w:rPr>
+          <w:b/>
+          <w:bCs/>
+        </w:rPr>
+        <w:t xml:space="preserve">twenty different guests in one weekend</w:t>
+      </w:r>
+      <w:r>
+        <w:t xml:space="preserve">, and hundreds across a season. Very few platforms multiply your hosting like that.</w:t>
+      </w:r>
+    </w:p>
+    <w:p>
+      <w:pPr>
+        <w:pBdr>
+          <w:left w:val="single" w:color="1F3864" w:sz="18"/>
+        </w:pBdr>
+        <w:shd w:fill="F2F4F8" w:val="clear"/>
+        <w:spacing w:after="60" w:before="0" w:line="264"/>
+        <w:ind w:left="280" w:right="120"/>
+      </w:pPr>
+      <w:r>
         <w:t xml:space="preserve"/>
       </w:r>
       <w:r>
@@ -3267,672 +3364,17 @@
       </w:r>
     </w:p>
     <w:p>
+      <w:r>
+        <w:br w:type="page"/>
+      </w:r>
+    </w:p>
+    <w:p>
       <w:pPr>
         <w:pStyle w:val="Heading1"/>
         <w:spacing w:after="160" w:before="360"/>
       </w:pPr>
       <w:r>
         <w:t xml:space="preserve">Part 5. Her questions: prepared answers</w:t>
-      </w:r>
-    </w:p>
-    <w:p>
-      <w:pPr>
-        <w:pStyle w:val="Heading2"/>
-        <w:spacing w:after="120" w:before="280"/>
-      </w:pPr>
-      <w:r>
-        <w:t xml:space="preserve">Q: What is the difference between partnering with F1 itself, a team, or a driver?</w:t>
-      </w:r>
-    </w:p>
-    <w:p>
-      <w:pPr>
-        <w:pBdr>
-          <w:left w:val="single" w:color="1F3864" w:sz="18"/>
-        </w:pBdr>
-        <w:shd w:fill="F2F4F8" w:val="clear"/>
-        <w:spacing w:after="60" w:before="80" w:line="264"/>
-        <w:ind w:left="280" w:right="120"/>
-      </w:pPr>
-      <w:r>
-        <w:t xml:space="preserve">Good question. Three doors into the sport.</w:t>
-      </w:r>
-    </w:p>
-    <w:p>
-      <w:pPr>
-        <w:pBdr>
-          <w:left w:val="single" w:color="1F3864" w:sz="18"/>
-        </w:pBdr>
-        <w:shd w:fill="F2F4F8" w:val="clear"/>
-        <w:spacing w:after="60" w:before="0" w:line="264"/>
-        <w:ind w:left="280" w:right="120"/>
-      </w:pPr>
-      <w:r>
-        <w:t xml:space="preserve"/>
-      </w:r>
-      <w:r>
-        <w:rPr>
-          <w:b/>
-          <w:bCs/>
-        </w:rPr>
-        <w:t xml:space="preserve">The series, Formula 1 itself.</w:t>
-      </w:r>
-      <w:r>
-        <w:t xml:space="preserve"> You partner with the sport, not with one team. Trackside branding at every race, race title rights, global reach, and you stay neutral, you never lose on a Sunday. But these are fewer, bigger deals at premium prices, and you are not part of a story. You are everywhere, but you belong to no one.</w:t>
-      </w:r>
-    </w:p>
-    <w:p>
-      <w:pPr>
-        <w:pBdr>
-          <w:left w:val="single" w:color="1F3864" w:sz="18"/>
-        </w:pBdr>
-        <w:shd w:fill="F2F4F8" w:val="clear"/>
-        <w:spacing w:after="60" w:before="0" w:line="264"/>
-        <w:ind w:left="280" w:right="120"/>
-      </w:pPr>
-      <w:r>
-        <w:t xml:space="preserve"/>
-      </w:r>
-      <w:r>
-        <w:rPr>
-          <w:b/>
-          <w:bCs/>
-        </w:rPr>
-        <w:t xml:space="preserve">A team.</w:t>
-      </w:r>
-      <w:r>
-        <w:t xml:space="preserve"> This is where the emotion lives. The car, the drivers, the wins, the setbacks. You get season-long visibility, content, hospitality, and the team's whole business ecosystem. There are many more entry points and price levels than at series level. For most brands, this is the right door.</w:t>
-      </w:r>
-    </w:p>
-    <w:p>
-      <w:pPr>
-        <w:pBdr>
-          <w:left w:val="single" w:color="1F3864" w:sz="18"/>
-        </w:pBdr>
-        <w:shd w:fill="F2F4F8" w:val="clear"/>
-        <w:spacing w:after="60" w:before="0" w:line="264"/>
-        <w:ind w:left="280" w:right="120"/>
-      </w:pPr>
-      <w:r>
-        <w:t xml:space="preserve"/>
-      </w:r>
-      <w:r>
-        <w:rPr>
-          <w:b/>
-          <w:bCs/>
-        </w:rPr>
-        <w:t xml:space="preserve">A driver personally.</w:t>
-      </w:r>
-      <w:r>
-        <w:t xml:space="preserve"> The smallest and simplest option. Space on a cap or helmet, the driver's personal social channels, some appearance days. Cheaper, yes. But you get no team rights, no car, no paddock hospitality, and the driver's team has to approve everything.</w:t>
-      </w:r>
-    </w:p>
-    <w:p>
-      <w:pPr>
-        <w:pBdr>
-          <w:left w:val="single" w:color="1F3864" w:sz="18"/>
-        </w:pBdr>
-        <w:shd w:fill="F2F4F8" w:val="clear"/>
-        <w:spacing w:after="160" w:before="0" w:line="264"/>
-        <w:ind w:left="280" w:right="120"/>
-      </w:pPr>
-      <w:r>
-        <w:t xml:space="preserve">The clear trend in the sport is that fans follow teams and drivers even more than the sport itself. Story beats logo. That is why our conversations usually start at team level, and the brief will tell us which team.</w:t>
-      </w:r>
-    </w:p>
-    <w:p>
-      <w:pPr>
-        <w:pStyle w:val="Heading2"/>
-        <w:spacing w:after="120" w:before="280"/>
-      </w:pPr>
-      <w:r>
-        <w:t xml:space="preserve">Q: You have so many partners per team. How does one brand get the visibility and attention it needs?</w:t>
-      </w:r>
-    </w:p>
-    <w:p>
-      <w:pPr>
-        <w:pBdr>
-          <w:left w:val="single" w:color="1F3864" w:sz="18"/>
-        </w:pBdr>
-        <w:shd w:fill="F2F4F8" w:val="clear"/>
-        <w:spacing w:after="60" w:before="80" w:line="264"/>
-        <w:ind w:left="280" w:right="120"/>
-      </w:pPr>
-      <w:r>
-        <w:t xml:space="preserve">Fair question. Thirty logos on a car sounds crowded. Three answers.</w:t>
-      </w:r>
-    </w:p>
-    <w:p>
-      <w:pPr>
-        <w:pBdr>
-          <w:left w:val="single" w:color="1F3864" w:sz="18"/>
-        </w:pBdr>
-        <w:shd w:fill="F2F4F8" w:val="clear"/>
-        <w:spacing w:after="60" w:before="0" w:line="264"/>
-        <w:ind w:left="280" w:right="120"/>
-      </w:pPr>
-      <w:r>
-        <w:t xml:space="preserve"/>
-      </w:r>
-      <w:r>
-        <w:rPr>
-          <w:b/>
-          <w:bCs/>
-        </w:rPr>
-        <w:t xml:space="preserve">First, a partnership is a structure, not a crowd.</w:t>
-      </w:r>
-      <w:r>
-        <w:t xml:space="preserve"> Every team organises its partners in clear tiers: title partner, principal partners, official partners. Your tier defines exactly what you own: the size and position of your branding on the car, your driver days, your content days, your hospitality allocation. It is all in the contract. Nothing is first come, first served.</w:t>
-      </w:r>
-    </w:p>
-    <w:p>
-      <w:pPr>
-        <w:pBdr>
-          <w:left w:val="single" w:color="1F3864" w:sz="18"/>
-        </w:pBdr>
-        <w:shd w:fill="F2F4F8" w:val="clear"/>
-        <w:spacing w:after="60" w:before="0" w:line="264"/>
-        <w:ind w:left="280" w:right="120"/>
-      </w:pPr>
-      <w:r>
-        <w:t xml:space="preserve"/>
-      </w:r>
-      <w:r>
-        <w:rPr>
-          <w:b/>
-          <w:bCs/>
-        </w:rPr>
-        <w:t xml:space="preserve">Second, exclusivity.</w:t>
-      </w:r>
-      <w:r>
-        <w:t xml:space="preserve"> Within your category, you are alone. The team cannot sign your competitor. So inside your world, you are not one of thirty. You are the only one.</w:t>
-      </w:r>
-    </w:p>
-    <w:p>
-      <w:pPr>
-        <w:pBdr>
-          <w:left w:val="single" w:color="1F3864" w:sz="18"/>
-        </w:pBdr>
-        <w:shd w:fill="F2F4F8" w:val="clear"/>
-        <w:spacing w:after="60" w:before="0" w:line="264"/>
-        <w:ind w:left="280" w:right="120"/>
-      </w:pPr>
-      <w:r>
-        <w:t xml:space="preserve"/>
-      </w:r>
-      <w:r>
-        <w:rPr>
-          <w:b/>
-          <w:bCs/>
-        </w:rPr>
-        <w:t xml:space="preserve">Third, attention is won through activation, not through logo size.</w:t>
-      </w:r>
-      <w:r>
-        <w:t xml:space="preserve"> The partners people remember are the ones who tell the best stories with the team: content, product integration, smart campaigns. That is where a digital-first brand like Redo can outperform much bigger names, and we and the team support you on that all season.</w:t>
-      </w:r>
-    </w:p>
-    <w:p>
-      <w:pPr>
-        <w:pBdr>
-          <w:left w:val="single" w:color="1F3864" w:sz="18"/>
-        </w:pBdr>
-        <w:shd w:fill="F2F4F8" w:val="clear"/>
-        <w:spacing w:after="160" w:before="0" w:line="264"/>
-        <w:ind w:left="280" w:right="120"/>
-      </w:pPr>
-      <w:r>
-        <w:t xml:space="preserve">And keep one thing in mind. Visibility is only half the value. The access, the hospitality, the introductions, those are </w:t>
-      </w:r>
-      <w:r>
-        <w:rPr>
-          <w:b/>
-          <w:bCs/>
-        </w:rPr>
-        <w:t xml:space="preserve">private rights</w:t>
-      </w:r>
-      <w:r>
-        <w:t xml:space="preserve">. They do not get diluted because other partners exist. If anything, more partners in the room means more companies for you to meet.</w:t>
-      </w:r>
-    </w:p>
-    <w:p>
-      <w:pPr>
-        <w:pStyle w:val="Heading2"/>
-        <w:spacing w:after="120" w:before="280"/>
-      </w:pPr>
-      <w:r>
-        <w:t xml:space="preserve">Q: How do teams help with B2B introductions?</w:t>
-      </w:r>
-    </w:p>
-    <w:p>
-      <w:pPr>
-        <w:pBdr>
-          <w:left w:val="single" w:color="1F3864" w:sz="18"/>
-        </w:pBdr>
-        <w:shd w:fill="F2F4F8" w:val="clear"/>
-        <w:spacing w:after="60" w:before="80" w:line="264"/>
-        <w:ind w:left="280" w:right="120"/>
-      </w:pPr>
-      <w:r>
-        <w:t xml:space="preserve">Very concretely. This is a managed process, not a cocktail party.</w:t>
-      </w:r>
-    </w:p>
-    <w:p>
-      <w:pPr>
-        <w:pBdr>
-          <w:left w:val="single" w:color="1F3864" w:sz="18"/>
-        </w:pBdr>
-        <w:shd w:fill="F2F4F8" w:val="clear"/>
-        <w:spacing w:after="60" w:before="0" w:line="264"/>
-        <w:ind w:left="280" w:right="120"/>
-      </w:pPr>
-      <w:r>
-        <w:t xml:space="preserve">Every team runs a family of at least 25 partners, and the team's partnership department actively connects them. They make </w:t>
-      </w:r>
-      <w:r>
-        <w:rPr>
-          <w:b/>
-          <w:bCs/>
-        </w:rPr>
-        <w:t xml:space="preserve">compliant introductions</w:t>
-      </w:r>
-      <w:r>
-        <w:t xml:space="preserve"> between partners, they host </w:t>
-      </w:r>
-      <w:r>
-        <w:rPr>
-          <w:b/>
-          <w:bCs/>
-        </w:rPr>
-        <w:t xml:space="preserve">partner summits</w:t>
-      </w:r>
-      <w:r>
-        <w:t xml:space="preserve">, business forums on race weekends, private dinners and roundtables. And it goes beyond the calendar, at events like CES, Davos and Cannes Lions.</w:t>
-      </w:r>
-    </w:p>
-    <w:p>
-      <w:pPr>
-        <w:pBdr>
-          <w:left w:val="single" w:color="1F3864" w:sz="18"/>
-        </w:pBdr>
-        <w:shd w:fill="F2F4F8" w:val="clear"/>
-        <w:spacing w:after="60" w:before="0" w:line="264"/>
-        <w:ind w:left="280" w:right="120"/>
-      </w:pPr>
-      <w:r>
-        <w:t xml:space="preserve">The best example from our own work is </w:t>
-      </w:r>
-      <w:r>
-        <w:rPr>
-          <w:b/>
-          <w:bCs/>
-        </w:rPr>
-        <w:t xml:space="preserve">Airwallex</w:t>
-      </w:r>
-      <w:r>
-        <w:t xml:space="preserve">, the payments company, a partner of McLaren, a deal our agency brokered. During the partnership, their revenue grew 50% year on year across EMEA and the Americas, and UK revenue grew 57% from new customer acquisition. That is what the platform can do when a partner works it properly.</w:t>
-      </w:r>
-    </w:p>
-    <w:p>
-      <w:pPr>
-        <w:pBdr>
-          <w:left w:val="single" w:color="1F3864" w:sz="18"/>
-        </w:pBdr>
-        <w:shd w:fill="F2F4F8" w:val="clear"/>
-        <w:spacing w:after="160" w:before="0" w:line="264"/>
-        <w:ind w:left="280" w:right="120"/>
-      </w:pPr>
-      <w:r>
-        <w:t xml:space="preserve">For Redo, picture it simply: 350 companies across the grid, many of them consumer brands and retailers, meeting each other all season. That is a pipeline, not a billboard.</w:t>
-      </w:r>
-    </w:p>
-    <w:p>
-      <w:pPr>
-        <w:pStyle w:val="Heading2"/>
-        <w:spacing w:after="120" w:before="280"/>
-      </w:pPr>
-      <w:r>
-        <w:t xml:space="preserve">Q: How do we know which sectors to target, and how do we reach them?</w:t>
-      </w:r>
-    </w:p>
-    <w:p>
-      <w:pPr>
-        <w:pBdr>
-          <w:left w:val="single" w:color="1F3864" w:sz="18"/>
-        </w:pBdr>
-        <w:shd w:fill="F2F4F8" w:val="clear"/>
-        <w:spacing w:after="60" w:before="80" w:line="264"/>
-        <w:ind w:left="280" w:right="120"/>
-      </w:pPr>
-      <w:r>
-        <w:t xml:space="preserve">We work backwards from your customers, not forwards from the sport.</w:t>
-      </w:r>
-    </w:p>
-    <w:p>
-      <w:pPr>
-        <w:pBdr>
-          <w:left w:val="single" w:color="1F3864" w:sz="18"/>
-        </w:pBdr>
-        <w:shd w:fill="F2F4F8" w:val="clear"/>
-        <w:spacing w:after="60" w:before="0" w:line="264"/>
-        <w:ind w:left="280" w:right="120"/>
-      </w:pPr>
-      <w:r>
-        <w:t xml:space="preserve"/>
-      </w:r>
-      <w:r>
-        <w:rPr>
-          <w:b/>
-          <w:bCs/>
-        </w:rPr>
-        <w:t xml:space="preserve">Step one is the brief</w:t>
-      </w:r>
-      <w:r>
-        <w:t xml:space="preserve"> we are building today. You tell me who you serve and who you want to win: sectors, size of merchant, markets.</w:t>
-      </w:r>
-    </w:p>
-    <w:p>
-      <w:pPr>
-        <w:pBdr>
-          <w:left w:val="single" w:color="1F3864" w:sz="18"/>
-        </w:pBdr>
-        <w:shd w:fill="F2F4F8" w:val="clear"/>
-        <w:spacing w:after="60" w:before="0" w:line="264"/>
-        <w:ind w:left="280" w:right="120"/>
-      </w:pPr>
-      <w:r>
-        <w:t xml:space="preserve"/>
-      </w:r>
-      <w:r>
-        <w:rPr>
-          <w:b/>
-          <w:bCs/>
-        </w:rPr>
-        <w:t xml:space="preserve">Step two, we map exactly that against the grid</w:t>
-      </w:r>
-      <w:r>
-        <w:t xml:space="preserve">, team by team. And I can tell you now what that map will show: the people you serve, and the people you are going after, are </w:t>
-      </w:r>
-      <w:r>
-        <w:rPr>
-          <w:b/>
-          <w:bCs/>
-        </w:rPr>
-        <w:t xml:space="preserve">already investing in this sport</w:t>
-      </w:r>
-      <w:r>
-        <w:t xml:space="preserve">. Direct-to-consumer brands like Eight Sleep, a partner of Aston Martin. Consumer names like LEGO and Tumi at McLaren, KitKat with Formula 1 itself, Louis Vuitton on the Monaco Grand Prix, Heineken across the sport. And commerce names too: Mastercard at McLaren, Visa Cash App on the Racing Bulls. Retailers and online brands. Your world is already in the paddock.</w:t>
-      </w:r>
-    </w:p>
-    <w:p>
-      <w:pPr>
-        <w:pBdr>
-          <w:left w:val="single" w:color="1F3864" w:sz="18"/>
-        </w:pBdr>
-        <w:shd w:fill="F2F4F8" w:val="clear"/>
-        <w:spacing w:after="160" w:before="0" w:line="264"/>
-        <w:ind w:left="280" w:right="120"/>
-      </w:pPr>
-      <w:r>
-        <w:t xml:space="preserve"/>
-      </w:r>
-      <w:r>
-        <w:rPr>
-          <w:b/>
-          <w:bCs/>
-        </w:rPr>
-        <w:t xml:space="preserve">Step three, we recommend the team where that overlap is strongest</w:t>
-      </w:r>
-      <w:r>
-        <w:t xml:space="preserve">, so your partner family is full of future customers. Then the platform does its work. You meet these companies as a fellow partner, race after race, all season. You are not cold-calling them anymore. You are standing next to them.</w:t>
-      </w:r>
-    </w:p>
-    <w:p>
-      <w:pPr>
-        <w:pStyle w:val="Heading2"/>
-        <w:spacing w:after="120" w:before="280"/>
-      </w:pPr>
-      <w:r>
-        <w:t xml:space="preserve">Q: How is ROI measured in Formula 1?</w:t>
-      </w:r>
-    </w:p>
-    <w:p>
-      <w:pPr>
-        <w:pBdr>
-          <w:left w:val="single" w:color="1F3864" w:sz="18"/>
-        </w:pBdr>
-        <w:shd w:fill="F2F4F8" w:val="clear"/>
-        <w:spacing w:after="60" w:before="80" w:line="264"/>
-        <w:ind w:left="280" w:right="120"/>
-      </w:pPr>
-      <w:r>
-        <w:t xml:space="preserve">Four ways, usually, and good teams report on all of them.</w:t>
-      </w:r>
-    </w:p>
-    <w:p>
-      <w:pPr>
-        <w:pBdr>
-          <w:left w:val="single" w:color="1F3864" w:sz="18"/>
-        </w:pBdr>
-        <w:shd w:fill="F2F4F8" w:val="clear"/>
-        <w:spacing w:after="60" w:before="0" w:line="264"/>
-        <w:ind w:left="280" w:right="120"/>
-      </w:pPr>
-      <w:r>
-        <w:t xml:space="preserve"/>
-      </w:r>
-      <w:r>
-        <w:rPr>
-          <w:b/>
-          <w:bCs/>
-        </w:rPr>
-        <w:t xml:space="preserve">Media value.</w:t>
-      </w:r>
-      <w:r>
-        <w:t xml:space="preserve"> Independent measurement firms, Nielsen for example, track every second your branding is on screen, across TV and digital, and give it a money value. You compare that number to your fee.</w:t>
-      </w:r>
-    </w:p>
-    <w:p>
-      <w:pPr>
-        <w:pBdr>
-          <w:left w:val="single" w:color="1F3864" w:sz="18"/>
-        </w:pBdr>
-        <w:shd w:fill="F2F4F8" w:val="clear"/>
-        <w:spacing w:after="60" w:before="0" w:line="264"/>
-        <w:ind w:left="280" w:right="120"/>
-      </w:pPr>
-      <w:r>
-        <w:t xml:space="preserve"/>
-      </w:r>
-      <w:r>
-        <w:rPr>
-          <w:b/>
-          <w:bCs/>
-        </w:rPr>
-        <w:t xml:space="preserve">Brand tracking.</w:t>
-      </w:r>
-      <w:r>
-        <w:t xml:space="preserve"> Awareness and consideration among fans, measured before and after. And F1 fans reward sponsors: in the US they are 32% more likely to consider a sponsor's product.</w:t>
-      </w:r>
-    </w:p>
-    <w:p>
-      <w:pPr>
-        <w:pBdr>
-          <w:left w:val="single" w:color="1F3864" w:sz="18"/>
-        </w:pBdr>
-        <w:shd w:fill="F2F4F8" w:val="clear"/>
-        <w:spacing w:after="60" w:before="0" w:line="264"/>
-        <w:ind w:left="280" w:right="120"/>
-      </w:pPr>
-      <w:r>
-        <w:t xml:space="preserve"/>
-      </w:r>
-      <w:r>
-        <w:rPr>
-          <w:b/>
-          <w:bCs/>
-        </w:rPr>
-        <w:t xml:space="preserve">Business pipeline.</w:t>
-      </w:r>
-      <w:r>
-        <w:t xml:space="preserve"> For B2B, you count introductions made, meetings held, and deals closed through the platform. That is how Airwallex could point to 50% revenue growth during their partnership.</w:t>
-      </w:r>
-    </w:p>
-    <w:p>
-      <w:pPr>
-        <w:pBdr>
-          <w:left w:val="single" w:color="1F3864" w:sz="18"/>
-        </w:pBdr>
-        <w:shd w:fill="F2F4F8" w:val="clear"/>
-        <w:spacing w:after="60" w:before="0" w:line="264"/>
-        <w:ind w:left="280" w:right="120"/>
-      </w:pPr>
-      <w:r>
-        <w:t xml:space="preserve"/>
-      </w:r>
-      <w:r>
-        <w:rPr>
-          <w:b/>
-          <w:bCs/>
-        </w:rPr>
-        <w:t xml:space="preserve">Hospitality outcomes.</w:t>
-      </w:r>
-      <w:r>
-        <w:t xml:space="preserve"> Which clients and prospects you hosted, and what those relationships produced afterwards.</w:t>
-      </w:r>
-    </w:p>
-    <w:p>
-      <w:pPr>
-        <w:pBdr>
-          <w:left w:val="single" w:color="1F3864" w:sz="18"/>
-        </w:pBdr>
-        <w:shd w:fill="F2F4F8" w:val="clear"/>
-        <w:spacing w:after="160" w:before="0" w:line="264"/>
-        <w:ind w:left="280" w:right="120"/>
-      </w:pPr>
-      <w:r>
-        <w:t xml:space="preserve">You agree the framework upfront, and you review it with the team every quarter. The good teams manage a partnership like a business, not like a sticker on a car.</w:t>
-      </w:r>
-    </w:p>
-    <w:p>
-      <w:pPr>
-        <w:pStyle w:val="Heading2"/>
-        <w:spacing w:after="120" w:before="280"/>
-      </w:pPr>
-      <w:r>
-        <w:t xml:space="preserve">Q: Who owns Formula 1? How does the money work?</w:t>
-      </w:r>
-    </w:p>
-    <w:p>
-      <w:pPr>
-        <w:pBdr>
-          <w:left w:val="single" w:color="1F3864" w:sz="18"/>
-        </w:pBdr>
-        <w:shd w:fill="F2F4F8" w:val="clear"/>
-        <w:spacing w:after="60" w:before="80" w:line="264"/>
-        <w:ind w:left="280" w:right="120"/>
-      </w:pPr>
-      <w:r>
-        <w:t xml:space="preserve">Three layers, very simple.</w:t>
-      </w:r>
-    </w:p>
-    <w:p>
-      <w:pPr>
-        <w:pBdr>
-          <w:left w:val="single" w:color="1F3864" w:sz="18"/>
-        </w:pBdr>
-        <w:shd w:fill="F2F4F8" w:val="clear"/>
-        <w:spacing w:after="60" w:before="0" w:line="264"/>
-        <w:ind w:left="280" w:right="120"/>
-      </w:pPr>
-      <w:r>
-        <w:t xml:space="preserve"/>
-      </w:r>
-      <w:r>
-        <w:rPr>
-          <w:b/>
-          <w:bCs/>
-        </w:rPr>
-        <w:t xml:space="preserve">Liberty Media</w:t>
-      </w:r>
-      <w:r>
-        <w:t xml:space="preserve">, an American media company, owns Formula 1 itself. They bought it in 2017. They control the commercial rights: races, broadcast deals, the calendar.</w:t>
-      </w:r>
-    </w:p>
-    <w:p>
-      <w:pPr>
-        <w:pBdr>
-          <w:left w:val="single" w:color="1F3864" w:sz="18"/>
-        </w:pBdr>
-        <w:shd w:fill="F2F4F8" w:val="clear"/>
-        <w:spacing w:after="60" w:before="0" w:line="264"/>
-        <w:ind w:left="280" w:right="120"/>
-      </w:pPr>
-      <w:r>
-        <w:t xml:space="preserve">The </w:t>
-      </w:r>
-      <w:r>
-        <w:rPr>
-          <w:b/>
-          <w:bCs/>
-        </w:rPr>
-        <w:t xml:space="preserve">FIA</w:t>
-      </w:r>
-      <w:r>
-        <w:t xml:space="preserve"> is the independent regulator. Rules and safety.</w:t>
-      </w:r>
-    </w:p>
-    <w:p>
-      <w:pPr>
-        <w:pBdr>
-          <w:left w:val="single" w:color="1F3864" w:sz="18"/>
-        </w:pBdr>
-        <w:shd w:fill="F2F4F8" w:val="clear"/>
-        <w:spacing w:after="60" w:before="0" w:line="264"/>
-        <w:ind w:left="280" w:right="120"/>
-      </w:pPr>
-      <w:r>
-        <w:t xml:space="preserve">The </w:t>
-      </w:r>
-      <w:r>
-        <w:rPr>
-          <w:b/>
-          <w:bCs/>
-        </w:rPr>
-        <w:t xml:space="preserve">eleven teams</w:t>
-      </w:r>
-      <w:r>
-        <w:t xml:space="preserve"> are independent businesses. Ferrari, Mercedes and Audi belong to car makers. Red Bull to the drinks company. Williams to a US investment firm. Aston Martin to a consortium led by Lawrence Stroll. Each team earns money in two ways: a share of the sport's revenues, and its own sponsorships.</w:t>
-      </w:r>
-    </w:p>
-    <w:p>
-      <w:pPr>
-        <w:pBdr>
-          <w:left w:val="single" w:color="1F3864" w:sz="18"/>
-        </w:pBdr>
-        <w:shd w:fill="F2F4F8" w:val="clear"/>
-        <w:spacing w:after="160" w:before="0" w:line="264"/>
-        <w:ind w:left="280" w:right="120"/>
-      </w:pPr>
-      <w:r>
-        <w:t xml:space="preserve">One thing worth knowing: since 2021 the sport has a </w:t>
-      </w:r>
-      <w:r>
-        <w:rPr>
-          <w:b/>
-          <w:bCs/>
-        </w:rPr>
-        <w:t xml:space="preserve">cost cap</w:t>
-      </w:r>
-      <w:r>
-        <w:t xml:space="preserve">. Teams cannot outspend each other without limit anymore. The result is that teams became profitable, stable businesses, and their values have grown sharply. Team sponsorship has doubled since 2020, from about one billion to 2.2 billion dollars a year, across 335 deals. So you would be entering a healthy, growing market. You can see it in the calibre of brands arriving: Microsoft joined Mercedes just this year.</w:t>
-      </w:r>
-    </w:p>
-    <w:p>
-      <w:pPr>
-        <w:pStyle w:val="Heading2"/>
-        <w:spacing w:after="120" w:before="280"/>
-      </w:pPr>
-      <w:r>
-        <w:t xml:space="preserve">Q: What does a partnership cost, and why is Formula 1 so expensive?</w:t>
       </w:r>
     </w:p>
     <w:p>
@@ -3947,7 +3389,165 @@
           <w:sz w:val="20"/>
           <w:szCs w:val="20"/>
         </w:rPr>
-        <w:t xml:space="preserve">[Only if she asks. Stay qualitative, ranges not quotes.]</w:t>
+        <w:t xml:space="preserve">[Quick index. Jump to any answer from the Navigation Pane.]</w:t>
+      </w:r>
+    </w:p>
+    <w:p>
+      <w:pPr>
+        <w:pStyle w:val="ListParagraph"/>
+        <w:numPr>
+          <w:ilvl w:val="0"/>
+          <w:numId w:val="2"/>
+        </w:numPr>
+        <w:spacing w:after="60"/>
+      </w:pPr>
+      <w:r>
+        <w:t xml:space="preserve"/>
+      </w:r>
+      <w:r>
+        <w:rPr>
+          <w:b/>
+          <w:bCs/>
+        </w:rPr>
+        <w:t xml:space="preserve">Q1</w:t>
+      </w:r>
+      <w:r>
+        <w:t xml:space="preserve"> Series vs team vs driver  |  </w:t>
+      </w:r>
+      <w:r>
+        <w:rPr>
+          <w:b/>
+          <w:bCs/>
+        </w:rPr>
+        <w:t xml:space="preserve">Q2</w:t>
+      </w:r>
+      <w:r>
+        <w:t xml:space="preserve"> Visibility among thirty partners  |  </w:t>
+      </w:r>
+      <w:r>
+        <w:rPr>
+          <w:b/>
+          <w:bCs/>
+        </w:rPr>
+        <w:t xml:space="preserve">Q3</w:t>
+      </w:r>
+      <w:r>
+        <w:t xml:space="preserve"> B2B introductions  |  </w:t>
+      </w:r>
+      <w:r>
+        <w:rPr>
+          <w:b/>
+          <w:bCs/>
+        </w:rPr>
+        <w:t xml:space="preserve">Q4</w:t>
+      </w:r>
+      <w:r>
+        <w:t xml:space="preserve"> Which sectors to target</w:t>
+      </w:r>
+    </w:p>
+    <w:p>
+      <w:pPr>
+        <w:pStyle w:val="ListParagraph"/>
+        <w:numPr>
+          <w:ilvl w:val="0"/>
+          <w:numId w:val="2"/>
+        </w:numPr>
+        <w:spacing w:after="60"/>
+      </w:pPr>
+      <w:r>
+        <w:t xml:space="preserve"/>
+      </w:r>
+      <w:r>
+        <w:rPr>
+          <w:b/>
+          <w:bCs/>
+        </w:rPr>
+        <w:t xml:space="preserve">Q5</w:t>
+      </w:r>
+      <w:r>
+        <w:t xml:space="preserve"> Measuring ROI  |  </w:t>
+      </w:r>
+      <w:r>
+        <w:rPr>
+          <w:b/>
+          <w:bCs/>
+        </w:rPr>
+        <w:t xml:space="preserve">Q6</w:t>
+      </w:r>
+      <w:r>
+        <w:t xml:space="preserve"> Who owns Formula 1  |  </w:t>
+      </w:r>
+      <w:r>
+        <w:rPr>
+          <w:b/>
+          <w:bCs/>
+        </w:rPr>
+        <w:t xml:space="preserve">Q7</w:t>
+      </w:r>
+      <w:r>
+        <w:t xml:space="preserve"> Cost, and why F1 is expensive  |  </w:t>
+      </w:r>
+      <w:r>
+        <w:rPr>
+          <w:b/>
+          <w:bCs/>
+        </w:rPr>
+        <w:t xml:space="preserve">Q8</w:t>
+      </w:r>
+      <w:r>
+        <w:t xml:space="preserve"> Why SPORTFIVE, why not go direct</w:t>
+      </w:r>
+    </w:p>
+    <w:p>
+      <w:pPr>
+        <w:pStyle w:val="ListParagraph"/>
+        <w:numPr>
+          <w:ilvl w:val="0"/>
+          <w:numId w:val="2"/>
+        </w:numPr>
+        <w:spacing w:after="60"/>
+      </w:pPr>
+      <w:r>
+        <w:t xml:space="preserve"/>
+      </w:r>
+      <w:r>
+        <w:rPr>
+          <w:b/>
+          <w:bCs/>
+        </w:rPr>
+        <w:t xml:space="preserve">Q9</w:t>
+      </w:r>
+      <w:r>
+        <w:t xml:space="preserve"> Are we too small  |  </w:t>
+      </w:r>
+      <w:r>
+        <w:rPr>
+          <w:b/>
+          <w:bCs/>
+        </w:rPr>
+        <w:t xml:space="preserve">Q10</w:t>
+      </w:r>
+      <w:r>
+        <w:t xml:space="preserve"> Is the audience only men  |  </w:t>
+      </w:r>
+      <w:r>
+        <w:rPr>
+          <w:b/>
+          <w:bCs/>
+        </w:rPr>
+        <w:t xml:space="preserve">Q11</w:t>
+      </w:r>
+      <w:r>
+        <w:t xml:space="preserve"> Are competitors already in</w:t>
+      </w:r>
+    </w:p>
+    <w:p>
+      <w:pPr>
+        <w:pStyle w:val="Heading2"/>
+        <w:spacing w:after="120" w:before="280"/>
+      </w:pPr>
+      <w:r>
+        <w:t xml:space="preserve">Q1. What is the difference between partnering with F1 itself, a team, or a driver?</w:t>
       </w:r>
     </w:p>
     <w:p>
@@ -3960,63 +3560,7 @@
         <w:ind w:left="280" w:right="120"/>
       </w:pPr>
       <w:r>
-        <w:t xml:space="preserve">Let me explain how the pricing works, because Formula 1 has its own logic.</w:t>
-      </w:r>
-    </w:p>
-    <w:p>
-      <w:pPr>
-        <w:pBdr>
-          <w:left w:val="single" w:color="1F3864" w:sz="18"/>
-        </w:pBdr>
-        <w:shd w:fill="F2F4F8" w:val="clear"/>
-        <w:spacing w:after="60" w:before="0" w:line="264"/>
-        <w:ind w:left="280" w:right="120"/>
-      </w:pPr>
-      <w:r>
-        <w:t xml:space="preserve">The price follows the rights inside the deal: your tier, the size and position of your branding, driver time, content days, hospitality volume, and the category you lock. More rights, higher price. As a rule of thumb: entry-level and supplier positions start in the </w:t>
-      </w:r>
-      <w:r>
-        <w:rPr>
-          <w:b/>
-          <w:bCs/>
-        </w:rPr>
-        <w:t xml:space="preserve">low single-digit millions</w:t>
-      </w:r>
-      <w:r>
-        <w:t xml:space="preserve"> per year. Meaningful official partner positions with real rights and hospitality sit in the </w:t>
-      </w:r>
-      <w:r>
-        <w:rPr>
-          <w:b/>
-          <w:bCs/>
-        </w:rPr>
-        <w:t xml:space="preserve">mid single-digit millions</w:t>
-      </w:r>
-      <w:r>
-        <w:t xml:space="preserve">. Title partnerships, the name on the team, are a different world, </w:t>
-      </w:r>
-      <w:r>
-        <w:rPr>
-          <w:b/>
-          <w:bCs/>
-        </w:rPr>
-        <w:t xml:space="preserve">well above fifty million</w:t>
-      </w:r>
-      <w:r>
-        <w:t xml:space="preserve"> a year.</w:t>
-      </w:r>
-    </w:p>
-    <w:p>
-      <w:pPr>
-        <w:pBdr>
-          <w:left w:val="single" w:color="1F3864" w:sz="18"/>
-        </w:pBdr>
-        <w:shd w:fill="F2F4F8" w:val="clear"/>
-        <w:spacing w:after="60" w:before="0" w:line="264"/>
-        <w:ind w:left="280" w:right="120"/>
-      </w:pPr>
-      <w:r>
-        <w:t xml:space="preserve">And yes, Formula 1 costs more than most sport. There are clear reasons.</w:t>
+        <w:t xml:space="preserve">Good question. Three doors into the sport.</w:t>
       </w:r>
     </w:p>
     <w:p>
@@ -4036,10 +3580,10 @@
           <w:b/>
           <w:bCs/>
         </w:rPr>
-        <w:t xml:space="preserve">First, supply.</w:t>
-      </w:r>
-      <w:r>
-        <w:t xml:space="preserve"> Football has hundreds of clubs. American leagues have around thirty teams, mostly in one market. Formula 1 has eleven teams, for the entire world. And inside each team, your category has exactly one seat. When a competitor takes it, it is gone, usually for three to five years. So for any brand, there are at most eleven doors on earth.</w:t>
+        <w:t xml:space="preserve">The series, Formula 1 itself.</w:t>
+      </w:r>
+      <w:r>
+        <w:t xml:space="preserve"> You partner with the sport, not with one team. Trackside branding at every race, race title rights, global reach, and you stay neutral, you never lose on a Sunday. But these are fewer, bigger deals at premium prices, and you are not part of a story. You are everywhere, but you belong to no one.</w:t>
       </w:r>
     </w:p>
     <w:p>
@@ -4059,10 +3603,10 @@
           <w:b/>
           <w:bCs/>
         </w:rPr>
-        <w:t xml:space="preserve">Second, demand.</w:t>
-      </w:r>
-      <w:r>
-        <w:t xml:space="preserve"> Team sponsorship has doubled since 2020, from about one billion to 2.2 billion dollars a year. New money keeps arriving: Microsoft joined Mercedes this year at a reported sixty million dollars a season. Tiny supply, growing demand. Prices rise.</w:t>
+        <w:t xml:space="preserve">A team.</w:t>
+      </w:r>
+      <w:r>
+        <w:t xml:space="preserve"> This is where the emotion lives. The car, the drivers, the wins, the setbacks. You get season-long visibility, content, hospitality, and the team's whole business ecosystem. There are many more entry points and price levels than at series level. For most brands, this is the right door.</w:t>
       </w:r>
     </w:p>
     <w:p>
@@ -4082,10 +3626,45 @@
           <w:b/>
           <w:bCs/>
         </w:rPr>
-        <w:t xml:space="preserve">Third, one deal covers the world.</w:t>
-      </w:r>
-      <w:r>
-        <w:t xml:space="preserve"> A domestic league lives mostly in its home market. Formula 1 gives you around 24 races across five continents, in one contract. For a brand going global, one F1 deal can replace many local ones.</w:t>
+        <w:t xml:space="preserve">A driver personally.</w:t>
+      </w:r>
+      <w:r>
+        <w:t xml:space="preserve"> The smallest and simplest option. Space on a cap or helmet, the driver's personal social channels, some appearance days. Cheaper, yes. But you get no team rights, no car, no paddock hospitality, and the driver's team has to approve everything.</w:t>
+      </w:r>
+    </w:p>
+    <w:p>
+      <w:pPr>
+        <w:pBdr>
+          <w:left w:val="single" w:color="1F3864" w:sz="18"/>
+        </w:pBdr>
+        <w:shd w:fill="F2F4F8" w:val="clear"/>
+        <w:spacing w:after="160" w:before="0" w:line="264"/>
+        <w:ind w:left="280" w:right="120"/>
+      </w:pPr>
+      <w:r>
+        <w:t xml:space="preserve">The clear trend in the sport is that fans follow teams and drivers even more than the sport itself. Story beats logo. That is why our conversations usually start at team level, and the brief will tell us which team.</w:t>
+      </w:r>
+    </w:p>
+    <w:p>
+      <w:pPr>
+        <w:pStyle w:val="Heading2"/>
+        <w:spacing w:after="120" w:before="280"/>
+      </w:pPr>
+      <w:r>
+        <w:t xml:space="preserve">Q2. You have so many partners per team. How does one brand get the visibility and attention it needs?</w:t>
+      </w:r>
+    </w:p>
+    <w:p>
+      <w:pPr>
+        <w:pBdr>
+          <w:left w:val="single" w:color="1F3864" w:sz="18"/>
+        </w:pBdr>
+        <w:shd w:fill="F2F4F8" w:val="clear"/>
+        <w:spacing w:after="60" w:before="80" w:line="264"/>
+        <w:ind w:left="280" w:right="120"/>
+      </w:pPr>
+      <w:r>
+        <w:t xml:space="preserve">Fair question. Thirty logos on a car sounds crowded. Three answers.</w:t>
       </w:r>
     </w:p>
     <w:p>
@@ -4105,10 +3684,56 @@
           <w:b/>
           <w:bCs/>
         </w:rPr>
-        <w:t xml:space="preserve">And fourth, access.</w:t>
-      </w:r>
-      <w:r>
-        <w:t xml:space="preserve"> The paddock, the hospitality, the room with 350 companies in it. That is what carries the price, because nobody else can offer it.</w:t>
+        <w:t xml:space="preserve">First, a partnership is a structure, not a crowd.</w:t>
+      </w:r>
+      <w:r>
+        <w:t xml:space="preserve"> Every team organises its partners in clear tiers: title partner, principal partners, official partners. Your tier defines exactly what you own: the size and position of your branding on the car, your driver days, your content days, your hospitality allocation. It is all in the contract. Nothing is first come, first served.</w:t>
+      </w:r>
+    </w:p>
+    <w:p>
+      <w:pPr>
+        <w:pBdr>
+          <w:left w:val="single" w:color="1F3864" w:sz="18"/>
+        </w:pBdr>
+        <w:shd w:fill="F2F4F8" w:val="clear"/>
+        <w:spacing w:after="60" w:before="0" w:line="264"/>
+        <w:ind w:left="280" w:right="120"/>
+      </w:pPr>
+      <w:r>
+        <w:t xml:space="preserve"/>
+      </w:r>
+      <w:r>
+        <w:rPr>
+          <w:b/>
+          <w:bCs/>
+        </w:rPr>
+        <w:t xml:space="preserve">Second, exclusivity.</w:t>
+      </w:r>
+      <w:r>
+        <w:t xml:space="preserve"> Within your category, you are alone. The team cannot sign your competitor. So inside your world, you are not one of thirty. You are the only one.</w:t>
+      </w:r>
+    </w:p>
+    <w:p>
+      <w:pPr>
+        <w:pBdr>
+          <w:left w:val="single" w:color="1F3864" w:sz="18"/>
+        </w:pBdr>
+        <w:shd w:fill="F2F4F8" w:val="clear"/>
+        <w:spacing w:after="60" w:before="0" w:line="264"/>
+        <w:ind w:left="280" w:right="120"/>
+      </w:pPr>
+      <w:r>
+        <w:t xml:space="preserve"/>
+      </w:r>
+      <w:r>
+        <w:rPr>
+          <w:b/>
+          <w:bCs/>
+        </w:rPr>
+        <w:t xml:space="preserve">Third, attention is won through activation, not through logo size.</w:t>
+      </w:r>
+      <w:r>
+        <w:t xml:space="preserve"> The partners people remember are the ones who tell the best stories with the team: content, product integration, smart campaigns. That is where a digital-first brand like Redo can outperform much bigger names, and we and the team support you on that all season.</w:t>
       </w:r>
     </w:p>
     <w:p>
@@ -4121,7 +3746,459 @@
         <w:ind w:left="280" w:right="120"/>
       </w:pPr>
       <w:r>
-        <w:t xml:space="preserve">This is why we do the brief first. Our job is to match the level to your goals, and then negotiate it hard on your side. And remember, our advice costs you nothing.</w:t>
+        <w:t xml:space="preserve">And keep one thing in mind. Visibility is only half the value. The access, the hospitality, the introductions, those are </w:t>
+      </w:r>
+      <w:r>
+        <w:rPr>
+          <w:b/>
+          <w:bCs/>
+        </w:rPr>
+        <w:t xml:space="preserve">private rights</w:t>
+      </w:r>
+      <w:r>
+        <w:t xml:space="preserve">. They do not get diluted because other partners exist. If anything, more partners in the room means more companies for you to meet.</w:t>
+      </w:r>
+    </w:p>
+    <w:p>
+      <w:pPr>
+        <w:pStyle w:val="Heading2"/>
+        <w:spacing w:after="120" w:before="280"/>
+      </w:pPr>
+      <w:r>
+        <w:t xml:space="preserve">Q3. How do teams help with B2B introductions?</w:t>
+      </w:r>
+    </w:p>
+    <w:p>
+      <w:pPr>
+        <w:pBdr>
+          <w:left w:val="single" w:color="1F3864" w:sz="18"/>
+        </w:pBdr>
+        <w:shd w:fill="F2F4F8" w:val="clear"/>
+        <w:spacing w:after="60" w:before="80" w:line="264"/>
+        <w:ind w:left="280" w:right="120"/>
+      </w:pPr>
+      <w:r>
+        <w:t xml:space="preserve">Very concretely. This is a managed process, not a cocktail party.</w:t>
+      </w:r>
+    </w:p>
+    <w:p>
+      <w:pPr>
+        <w:pBdr>
+          <w:left w:val="single" w:color="1F3864" w:sz="18"/>
+        </w:pBdr>
+        <w:shd w:fill="F2F4F8" w:val="clear"/>
+        <w:spacing w:after="60" w:before="0" w:line="264"/>
+        <w:ind w:left="280" w:right="120"/>
+      </w:pPr>
+      <w:r>
+        <w:t xml:space="preserve">Every team runs a family of at least 25 partners, and the team's partnership department actively connects them. They make </w:t>
+      </w:r>
+      <w:r>
+        <w:rPr>
+          <w:b/>
+          <w:bCs/>
+        </w:rPr>
+        <w:t xml:space="preserve">compliant introductions</w:t>
+      </w:r>
+      <w:r>
+        <w:t xml:space="preserve"> between partners, they host </w:t>
+      </w:r>
+      <w:r>
+        <w:rPr>
+          <w:b/>
+          <w:bCs/>
+        </w:rPr>
+        <w:t xml:space="preserve">partner summits</w:t>
+      </w:r>
+      <w:r>
+        <w:t xml:space="preserve">, business forums on race weekends, private dinners and roundtables. And it goes beyond the calendar, at events like CES, Davos and Cannes Lions.</w:t>
+      </w:r>
+    </w:p>
+    <w:p>
+      <w:pPr>
+        <w:pBdr>
+          <w:left w:val="single" w:color="1F3864" w:sz="18"/>
+        </w:pBdr>
+        <w:shd w:fill="F2F4F8" w:val="clear"/>
+        <w:spacing w:after="60" w:before="0" w:line="264"/>
+        <w:ind w:left="280" w:right="120"/>
+      </w:pPr>
+      <w:r>
+        <w:t xml:space="preserve">The best example from our own work is </w:t>
+      </w:r>
+      <w:r>
+        <w:rPr>
+          <w:b/>
+          <w:bCs/>
+        </w:rPr>
+        <w:t xml:space="preserve">Airwallex</w:t>
+      </w:r>
+      <w:r>
+        <w:t xml:space="preserve">, the payments company, a partner of McLaren, a deal our agency brokered. During the partnership, their revenue grew 50% year on year across EMEA and the Americas, and UK revenue grew 57% from new customer acquisition. That is what the platform can do when a partner works it properly.</w:t>
+      </w:r>
+    </w:p>
+    <w:p>
+      <w:pPr>
+        <w:pBdr>
+          <w:left w:val="single" w:color="1F3864" w:sz="18"/>
+        </w:pBdr>
+        <w:shd w:fill="F2F4F8" w:val="clear"/>
+        <w:spacing w:after="160" w:before="0" w:line="264"/>
+        <w:ind w:left="280" w:right="120"/>
+      </w:pPr>
+      <w:r>
+        <w:t xml:space="preserve">For Redo, picture it simply: 350 companies across the grid, many of them consumer brands and retailers, meeting each other all season. That is a pipeline, not a billboard.</w:t>
+      </w:r>
+    </w:p>
+    <w:p>
+      <w:pPr>
+        <w:pStyle w:val="Heading2"/>
+        <w:spacing w:after="120" w:before="280"/>
+      </w:pPr>
+      <w:r>
+        <w:t xml:space="preserve">Q4. How do we know which sectors to target, and how do we reach them?</w:t>
+      </w:r>
+    </w:p>
+    <w:p>
+      <w:pPr>
+        <w:pBdr>
+          <w:left w:val="single" w:color="1F3864" w:sz="18"/>
+        </w:pBdr>
+        <w:shd w:fill="F2F4F8" w:val="clear"/>
+        <w:spacing w:after="60" w:before="80" w:line="264"/>
+        <w:ind w:left="280" w:right="120"/>
+      </w:pPr>
+      <w:r>
+        <w:t xml:space="preserve">We work backwards from your customers, not forwards from the sport.</w:t>
+      </w:r>
+    </w:p>
+    <w:p>
+      <w:pPr>
+        <w:pBdr>
+          <w:left w:val="single" w:color="1F3864" w:sz="18"/>
+        </w:pBdr>
+        <w:shd w:fill="F2F4F8" w:val="clear"/>
+        <w:spacing w:after="60" w:before="0" w:line="264"/>
+        <w:ind w:left="280" w:right="120"/>
+      </w:pPr>
+      <w:r>
+        <w:t xml:space="preserve"/>
+      </w:r>
+      <w:r>
+        <w:rPr>
+          <w:b/>
+          <w:bCs/>
+        </w:rPr>
+        <w:t xml:space="preserve">Step one is the brief</w:t>
+      </w:r>
+      <w:r>
+        <w:t xml:space="preserve"> we are building today. You tell me who you serve and who you want to win: sectors, size of merchant, markets.</w:t>
+      </w:r>
+    </w:p>
+    <w:p>
+      <w:pPr>
+        <w:pBdr>
+          <w:left w:val="single" w:color="1F3864" w:sz="18"/>
+        </w:pBdr>
+        <w:shd w:fill="F2F4F8" w:val="clear"/>
+        <w:spacing w:after="60" w:before="0" w:line="264"/>
+        <w:ind w:left="280" w:right="120"/>
+      </w:pPr>
+      <w:r>
+        <w:t xml:space="preserve"/>
+      </w:r>
+      <w:r>
+        <w:rPr>
+          <w:b/>
+          <w:bCs/>
+        </w:rPr>
+        <w:t xml:space="preserve">Step two, we map exactly that against the grid</w:t>
+      </w:r>
+      <w:r>
+        <w:t xml:space="preserve">, team by team. And I can tell you now what that map will show: the people you serve, and the people you are going after, are </w:t>
+      </w:r>
+      <w:r>
+        <w:rPr>
+          <w:b/>
+          <w:bCs/>
+        </w:rPr>
+        <w:t xml:space="preserve">already investing in this sport</w:t>
+      </w:r>
+      <w:r>
+        <w:t xml:space="preserve">. Direct-to-consumer brands like Eight Sleep, a partner of Aston Martin. Consumer names like LEGO and Tumi at McLaren, KitKat with Formula 1 itself, Louis Vuitton on the Monaco Grand Prix, Heineken across the sport. And commerce names too: Mastercard at McLaren, Visa Cash App on the Racing Bulls. Retailers and online brands. Your world is already in the paddock.</w:t>
+      </w:r>
+    </w:p>
+    <w:p>
+      <w:pPr>
+        <w:pBdr>
+          <w:left w:val="single" w:color="1F3864" w:sz="18"/>
+        </w:pBdr>
+        <w:shd w:fill="F2F4F8" w:val="clear"/>
+        <w:spacing w:after="160" w:before="0" w:line="264"/>
+        <w:ind w:left="280" w:right="120"/>
+      </w:pPr>
+      <w:r>
+        <w:t xml:space="preserve"/>
+      </w:r>
+      <w:r>
+        <w:rPr>
+          <w:b/>
+          <w:bCs/>
+        </w:rPr>
+        <w:t xml:space="preserve">Step three, we recommend the team where that overlap is strongest</w:t>
+      </w:r>
+      <w:r>
+        <w:t xml:space="preserve">, so your partner family is full of future customers. Then the platform does its work. You meet these companies as a fellow partner, race after race, all season. You are not cold-calling them anymore. You are standing next to them.</w:t>
+      </w:r>
+    </w:p>
+    <w:p>
+      <w:pPr>
+        <w:pStyle w:val="Heading2"/>
+        <w:spacing w:after="120" w:before="280"/>
+      </w:pPr>
+      <w:r>
+        <w:t xml:space="preserve">Q5. How is ROI measured in Formula 1?</w:t>
+      </w:r>
+    </w:p>
+    <w:p>
+      <w:pPr>
+        <w:pBdr>
+          <w:left w:val="single" w:color="1F3864" w:sz="18"/>
+        </w:pBdr>
+        <w:shd w:fill="F2F4F8" w:val="clear"/>
+        <w:spacing w:after="60" w:before="80" w:line="264"/>
+        <w:ind w:left="280" w:right="120"/>
+      </w:pPr>
+      <w:r>
+        <w:t xml:space="preserve">Four ways, usually, and good teams report on all of them.</w:t>
+      </w:r>
+    </w:p>
+    <w:p>
+      <w:pPr>
+        <w:pBdr>
+          <w:left w:val="single" w:color="1F3864" w:sz="18"/>
+        </w:pBdr>
+        <w:shd w:fill="F2F4F8" w:val="clear"/>
+        <w:spacing w:after="60" w:before="0" w:line="264"/>
+        <w:ind w:left="280" w:right="120"/>
+      </w:pPr>
+      <w:r>
+        <w:t xml:space="preserve"/>
+      </w:r>
+      <w:r>
+        <w:rPr>
+          <w:b/>
+          <w:bCs/>
+        </w:rPr>
+        <w:t xml:space="preserve">Media value.</w:t>
+      </w:r>
+      <w:r>
+        <w:t xml:space="preserve"> Independent measurement firms, Nielsen for example, track every second your branding is on screen, across TV and digital, and give it a money value. You compare that number to your fee.</w:t>
+      </w:r>
+    </w:p>
+    <w:p>
+      <w:pPr>
+        <w:pBdr>
+          <w:left w:val="single" w:color="1F3864" w:sz="18"/>
+        </w:pBdr>
+        <w:shd w:fill="F2F4F8" w:val="clear"/>
+        <w:spacing w:after="60" w:before="0" w:line="264"/>
+        <w:ind w:left="280" w:right="120"/>
+      </w:pPr>
+      <w:r>
+        <w:t xml:space="preserve"/>
+      </w:r>
+      <w:r>
+        <w:rPr>
+          <w:b/>
+          <w:bCs/>
+        </w:rPr>
+        <w:t xml:space="preserve">Brand tracking.</w:t>
+      </w:r>
+      <w:r>
+        <w:t xml:space="preserve"> Awareness and consideration among fans, measured before and after. And F1 fans reward sponsors: in the US they are 32% more likely to consider a sponsor's product.</w:t>
+      </w:r>
+    </w:p>
+    <w:p>
+      <w:pPr>
+        <w:pBdr>
+          <w:left w:val="single" w:color="1F3864" w:sz="18"/>
+        </w:pBdr>
+        <w:shd w:fill="F2F4F8" w:val="clear"/>
+        <w:spacing w:after="60" w:before="0" w:line="264"/>
+        <w:ind w:left="280" w:right="120"/>
+      </w:pPr>
+      <w:r>
+        <w:t xml:space="preserve"/>
+      </w:r>
+      <w:r>
+        <w:rPr>
+          <w:b/>
+          <w:bCs/>
+        </w:rPr>
+        <w:t xml:space="preserve">Business pipeline.</w:t>
+      </w:r>
+      <w:r>
+        <w:t xml:space="preserve"> For B2B, you count introductions made, meetings held, and deals closed through the platform. That is how Airwallex could point to 50% revenue growth during their partnership.</w:t>
+      </w:r>
+    </w:p>
+    <w:p>
+      <w:pPr>
+        <w:pBdr>
+          <w:left w:val="single" w:color="1F3864" w:sz="18"/>
+        </w:pBdr>
+        <w:shd w:fill="F2F4F8" w:val="clear"/>
+        <w:spacing w:after="60" w:before="0" w:line="264"/>
+        <w:ind w:left="280" w:right="120"/>
+      </w:pPr>
+      <w:r>
+        <w:t xml:space="preserve"/>
+      </w:r>
+      <w:r>
+        <w:rPr>
+          <w:b/>
+          <w:bCs/>
+        </w:rPr>
+        <w:t xml:space="preserve">Hospitality outcomes.</w:t>
+      </w:r>
+      <w:r>
+        <w:t xml:space="preserve"> Which clients and prospects you hosted, and what those relationships produced afterwards.</w:t>
+      </w:r>
+    </w:p>
+    <w:p>
+      <w:pPr>
+        <w:pBdr>
+          <w:left w:val="single" w:color="1F3864" w:sz="18"/>
+        </w:pBdr>
+        <w:shd w:fill="F2F4F8" w:val="clear"/>
+        <w:spacing w:after="160" w:before="0" w:line="264"/>
+        <w:ind w:left="280" w:right="120"/>
+      </w:pPr>
+      <w:r>
+        <w:t xml:space="preserve">You agree the framework upfront, and you review it with the team every quarter. The good teams manage a partnership like a business, not like a sticker on a car.</w:t>
+      </w:r>
+    </w:p>
+    <w:p>
+      <w:pPr>
+        <w:pStyle w:val="Heading2"/>
+        <w:spacing w:after="120" w:before="280"/>
+      </w:pPr>
+      <w:r>
+        <w:t xml:space="preserve">Q6. Who owns Formula 1? How does the money work?</w:t>
+      </w:r>
+    </w:p>
+    <w:p>
+      <w:pPr>
+        <w:pBdr>
+          <w:left w:val="single" w:color="1F3864" w:sz="18"/>
+        </w:pBdr>
+        <w:shd w:fill="F2F4F8" w:val="clear"/>
+        <w:spacing w:after="60" w:before="80" w:line="264"/>
+        <w:ind w:left="280" w:right="120"/>
+      </w:pPr>
+      <w:r>
+        <w:t xml:space="preserve">Three layers, very simple.</w:t>
+      </w:r>
+    </w:p>
+    <w:p>
+      <w:pPr>
+        <w:pBdr>
+          <w:left w:val="single" w:color="1F3864" w:sz="18"/>
+        </w:pBdr>
+        <w:shd w:fill="F2F4F8" w:val="clear"/>
+        <w:spacing w:after="60" w:before="0" w:line="264"/>
+        <w:ind w:left="280" w:right="120"/>
+      </w:pPr>
+      <w:r>
+        <w:t xml:space="preserve"/>
+      </w:r>
+      <w:r>
+        <w:rPr>
+          <w:b/>
+          <w:bCs/>
+        </w:rPr>
+        <w:t xml:space="preserve">Liberty Media</w:t>
+      </w:r>
+      <w:r>
+        <w:t xml:space="preserve">, an American media company, owns Formula 1 itself. They bought it in 2017. They control the commercial rights: races, broadcast deals, the calendar.</w:t>
+      </w:r>
+    </w:p>
+    <w:p>
+      <w:pPr>
+        <w:pBdr>
+          <w:left w:val="single" w:color="1F3864" w:sz="18"/>
+        </w:pBdr>
+        <w:shd w:fill="F2F4F8" w:val="clear"/>
+        <w:spacing w:after="60" w:before="0" w:line="264"/>
+        <w:ind w:left="280" w:right="120"/>
+      </w:pPr>
+      <w:r>
+        <w:t xml:space="preserve">The </w:t>
+      </w:r>
+      <w:r>
+        <w:rPr>
+          <w:b/>
+          <w:bCs/>
+        </w:rPr>
+        <w:t xml:space="preserve">FIA</w:t>
+      </w:r>
+      <w:r>
+        <w:t xml:space="preserve"> is the independent regulator. Rules and safety.</w:t>
+      </w:r>
+    </w:p>
+    <w:p>
+      <w:pPr>
+        <w:pBdr>
+          <w:left w:val="single" w:color="1F3864" w:sz="18"/>
+        </w:pBdr>
+        <w:shd w:fill="F2F4F8" w:val="clear"/>
+        <w:spacing w:after="60" w:before="0" w:line="264"/>
+        <w:ind w:left="280" w:right="120"/>
+      </w:pPr>
+      <w:r>
+        <w:t xml:space="preserve">The </w:t>
+      </w:r>
+      <w:r>
+        <w:rPr>
+          <w:b/>
+          <w:bCs/>
+        </w:rPr>
+        <w:t xml:space="preserve">eleven teams</w:t>
+      </w:r>
+      <w:r>
+        <w:t xml:space="preserve"> are independent businesses. Ferrari, Mercedes and Audi belong to car makers. Red Bull to the drinks company. Williams to a US investment firm. Aston Martin to a consortium led by Lawrence Stroll. Each team earns money in two ways: a share of the sport's revenues, and its own sponsorships.</w:t>
+      </w:r>
+    </w:p>
+    <w:p>
+      <w:pPr>
+        <w:pBdr>
+          <w:left w:val="single" w:color="1F3864" w:sz="18"/>
+        </w:pBdr>
+        <w:shd w:fill="F2F4F8" w:val="clear"/>
+        <w:spacing w:after="160" w:before="0" w:line="264"/>
+        <w:ind w:left="280" w:right="120"/>
+      </w:pPr>
+      <w:r>
+        <w:t xml:space="preserve">One thing worth knowing: since 2021 the sport has a </w:t>
+      </w:r>
+      <w:r>
+        <w:rPr>
+          <w:b/>
+          <w:bCs/>
+        </w:rPr>
+        <w:t xml:space="preserve">cost cap</w:t>
+      </w:r>
+      <w:r>
+        <w:t xml:space="preserve">. Teams cannot outspend each other without limit anymore. The result is that teams became profitable, stable businesses, and their values have grown sharply. Team sponsorship has doubled since 2020, from about one billion to 2.2 billion dollars a year, across 335 deals. So you would be entering a healthy, growing market. You can see it in the calibre of brands arriving: Microsoft joined Mercedes just this year.</w:t>
+      </w:r>
+    </w:p>
+    <w:p>
+      <w:pPr>
+        <w:pStyle w:val="Heading2"/>
+        <w:spacing w:after="120" w:before="280"/>
+      </w:pPr>
+      <w:r>
+        <w:t xml:space="preserve">Q7. What does a partnership cost, and why is Formula 1 so expensive?</w:t>
       </w:r>
     </w:p>
     <w:p>
@@ -4136,6 +4213,195 @@
           <w:sz w:val="20"/>
           <w:szCs w:val="20"/>
         </w:rPr>
+        <w:t xml:space="preserve">[Only if she asks. Stay qualitative, ranges not quotes.]</w:t>
+      </w:r>
+    </w:p>
+    <w:p>
+      <w:pPr>
+        <w:pBdr>
+          <w:left w:val="single" w:color="1F3864" w:sz="18"/>
+        </w:pBdr>
+        <w:shd w:fill="F2F4F8" w:val="clear"/>
+        <w:spacing w:after="60" w:before="80" w:line="264"/>
+        <w:ind w:left="280" w:right="120"/>
+      </w:pPr>
+      <w:r>
+        <w:t xml:space="preserve">Let me explain how the pricing works, because Formula 1 has its own logic.</w:t>
+      </w:r>
+    </w:p>
+    <w:p>
+      <w:pPr>
+        <w:pBdr>
+          <w:left w:val="single" w:color="1F3864" w:sz="18"/>
+        </w:pBdr>
+        <w:shd w:fill="F2F4F8" w:val="clear"/>
+        <w:spacing w:after="60" w:before="0" w:line="264"/>
+        <w:ind w:left="280" w:right="120"/>
+      </w:pPr>
+      <w:r>
+        <w:t xml:space="preserve">The price follows the rights inside the deal: your tier, the size and position of your branding, driver time, content days, hospitality volume, and the category you lock. More rights, higher price. As a rule of thumb: entry-level and supplier positions start in the </w:t>
+      </w:r>
+      <w:r>
+        <w:rPr>
+          <w:b/>
+          <w:bCs/>
+        </w:rPr>
+        <w:t xml:space="preserve">low single-digit millions</w:t>
+      </w:r>
+      <w:r>
+        <w:t xml:space="preserve"> per year. Meaningful official partner positions with real rights and hospitality sit in the </w:t>
+      </w:r>
+      <w:r>
+        <w:rPr>
+          <w:b/>
+          <w:bCs/>
+        </w:rPr>
+        <w:t xml:space="preserve">mid single-digit millions</w:t>
+      </w:r>
+      <w:r>
+        <w:t xml:space="preserve">. Title partnerships, the name on the team, are a different world, </w:t>
+      </w:r>
+      <w:r>
+        <w:rPr>
+          <w:b/>
+          <w:bCs/>
+        </w:rPr>
+        <w:t xml:space="preserve">well above fifty million</w:t>
+      </w:r>
+      <w:r>
+        <w:t xml:space="preserve"> a year.</w:t>
+      </w:r>
+    </w:p>
+    <w:p>
+      <w:pPr>
+        <w:pBdr>
+          <w:left w:val="single" w:color="1F3864" w:sz="18"/>
+        </w:pBdr>
+        <w:shd w:fill="F2F4F8" w:val="clear"/>
+        <w:spacing w:after="60" w:before="0" w:line="264"/>
+        <w:ind w:left="280" w:right="120"/>
+      </w:pPr>
+      <w:r>
+        <w:t xml:space="preserve">And yes, Formula 1 costs more than most sport. There are clear reasons.</w:t>
+      </w:r>
+    </w:p>
+    <w:p>
+      <w:pPr>
+        <w:pBdr>
+          <w:left w:val="single" w:color="1F3864" w:sz="18"/>
+        </w:pBdr>
+        <w:shd w:fill="F2F4F8" w:val="clear"/>
+        <w:spacing w:after="60" w:before="0" w:line="264"/>
+        <w:ind w:left="280" w:right="120"/>
+      </w:pPr>
+      <w:r>
+        <w:t xml:space="preserve"/>
+      </w:r>
+      <w:r>
+        <w:rPr>
+          <w:b/>
+          <w:bCs/>
+        </w:rPr>
+        <w:t xml:space="preserve">First, supply.</w:t>
+      </w:r>
+      <w:r>
+        <w:t xml:space="preserve"> Football has hundreds of clubs. American leagues have around thirty teams, mostly in one market. Formula 1 has eleven teams, for the entire world. And inside each team, your category has exactly one seat. When a competitor takes it, it is gone, usually for three to five years. So for any brand, there are at most eleven doors on earth.</w:t>
+      </w:r>
+    </w:p>
+    <w:p>
+      <w:pPr>
+        <w:pBdr>
+          <w:left w:val="single" w:color="1F3864" w:sz="18"/>
+        </w:pBdr>
+        <w:shd w:fill="F2F4F8" w:val="clear"/>
+        <w:spacing w:after="60" w:before="0" w:line="264"/>
+        <w:ind w:left="280" w:right="120"/>
+      </w:pPr>
+      <w:r>
+        <w:t xml:space="preserve"/>
+      </w:r>
+      <w:r>
+        <w:rPr>
+          <w:b/>
+          <w:bCs/>
+        </w:rPr>
+        <w:t xml:space="preserve">Second, demand.</w:t>
+      </w:r>
+      <w:r>
+        <w:t xml:space="preserve"> Team sponsorship has doubled since 2020, from about one billion to 2.2 billion dollars a year. New money keeps arriving: Microsoft joined Mercedes this year at a reported sixty million dollars a season. Tiny supply, growing demand. Prices rise.</w:t>
+      </w:r>
+    </w:p>
+    <w:p>
+      <w:pPr>
+        <w:pBdr>
+          <w:left w:val="single" w:color="1F3864" w:sz="18"/>
+        </w:pBdr>
+        <w:shd w:fill="F2F4F8" w:val="clear"/>
+        <w:spacing w:after="60" w:before="0" w:line="264"/>
+        <w:ind w:left="280" w:right="120"/>
+      </w:pPr>
+      <w:r>
+        <w:t xml:space="preserve"/>
+      </w:r>
+      <w:r>
+        <w:rPr>
+          <w:b/>
+          <w:bCs/>
+        </w:rPr>
+        <w:t xml:space="preserve">Third, one deal covers the world.</w:t>
+      </w:r>
+      <w:r>
+        <w:t xml:space="preserve"> A domestic league lives mostly in its home market. Formula 1 gives you around 24 races across five continents, in one contract. For a brand going global, one F1 deal can replace many local ones.</w:t>
+      </w:r>
+    </w:p>
+    <w:p>
+      <w:pPr>
+        <w:pBdr>
+          <w:left w:val="single" w:color="1F3864" w:sz="18"/>
+        </w:pBdr>
+        <w:shd w:fill="F2F4F8" w:val="clear"/>
+        <w:spacing w:after="60" w:before="0" w:line="264"/>
+        <w:ind w:left="280" w:right="120"/>
+      </w:pPr>
+      <w:r>
+        <w:t xml:space="preserve"/>
+      </w:r>
+      <w:r>
+        <w:rPr>
+          <w:b/>
+          <w:bCs/>
+        </w:rPr>
+        <w:t xml:space="preserve">And fourth, access.</w:t>
+      </w:r>
+      <w:r>
+        <w:t xml:space="preserve"> The paddock, the hospitality, the room with 350 companies in it. That is what carries the price, because nobody else can offer it.</w:t>
+      </w:r>
+    </w:p>
+    <w:p>
+      <w:pPr>
+        <w:pBdr>
+          <w:left w:val="single" w:color="1F3864" w:sz="18"/>
+        </w:pBdr>
+        <w:shd w:fill="F2F4F8" w:val="clear"/>
+        <w:spacing w:after="160" w:before="0" w:line="264"/>
+        <w:ind w:left="280" w:right="120"/>
+      </w:pPr>
+      <w:r>
+        <w:t xml:space="preserve">This is why we do the brief first. Our job is to match the level to your goals, and then negotiate it hard on your side. And remember, our advice costs you nothing.</w:t>
+      </w:r>
+    </w:p>
+    <w:p>
+      <w:pPr>
+        <w:spacing w:after="100" w:before="60"/>
+      </w:pPr>
+      <w:r>
+        <w:rPr>
+          <w:i/>
+          <w:iCs/>
+          <w:color w:val="595959"/>
+          <w:sz w:val="20"/>
+          <w:szCs w:val="20"/>
+        </w:rPr>
         <w:t xml:space="preserve">[Background for you, never quoted on the call: reported title benchmarks run around $75M to $110M a year at the top teams.]</w:t>
       </w:r>
     </w:p>
@@ -4145,7 +4411,7 @@
         <w:spacing w:after="120" w:before="280"/>
       </w:pPr>
       <w:r>
-        <w:t xml:space="preserve">Q: Why work with SPORTFIVE? Could we not go to a team directly?</w:t>
+        <w:t xml:space="preserve">Q8. Why work with SPORTFIVE? Could we not go to a team directly?</w:t>
       </w:r>
     </w:p>
     <w:p>
@@ -4226,7 +4492,7 @@
         <w:spacing w:after="120" w:before="280"/>
       </w:pPr>
       <w:r>
-        <w:t xml:space="preserve">Q: Are we too small for Formula 1?</w:t>
+        <w:t xml:space="preserve">Q9. Are we too small for Formula 1?</w:t>
       </w:r>
     </w:p>
     <w:p>
@@ -4284,7 +4550,7 @@
         <w:spacing w:after="120" w:before="280"/>
       </w:pPr>
       <w:r>
-        <w:t xml:space="preserve">Q: Is the audience not mostly men who love cars?</w:t>
+        <w:t xml:space="preserve">Q10. Is the audience not mostly men who love cars?</w:t>
       </w:r>
     </w:p>
     <w:p>
@@ -4342,7 +4608,7 @@
         <w:spacing w:after="120" w:before="280"/>
       </w:pPr>
       <w:r>
-        <w:t xml:space="preserve">Q: Are any of our competitors already in Formula 1?</w:t>
+        <w:t xml:space="preserve">Q11. Are any of our competitors already in Formula 1?</w:t>
       </w:r>
     </w:p>
     <w:p>

</xml_diff>